<commit_message>
feat(inversiones): complete all investment contract templates
Registers the remaining 5 investment ContractTypes with their templates,
signer configs and signature patterns. With this commit, every document
in the "inversiones" category can be generated end-to-end:

- ACUERDO_INVERSION_CASH_IN
- CARTA_CONFIRMACION_INVERSION_INICIAL (Anexo 1)
- CARTA_ELECCION_MODALIDAD_PAGO_REINVERSION (Anexo 2)
- CARTA_INSTRUCCION_INVERSION_CARTERA_ACTIVA (Anexo 3)
- CARTA_INCREMENTO_INVERSION (Anexo 4)
- CARTA_INSTRUCCION_PAGO_ANTICIPADO (Anexo 6)
- CESION_CREDITOS
- CONTRATO_SERVICIOS_CASH_IN_INVERSOR_GENERAL
- DESIGNACION_BENEFICIARIO (Anexo 7) - new

Anexo 7 doc has been edited via python-docx so the beneficiarios table
uses the docxtemplater loop pattern: the data row is wrapped with
{#listaBeneficiarios}...{/listaBeneficiarios} and replicates per item.

Backend schema also picks up the new 'designacion_beneficiario' enum
value.

Co-Authored-By: Claude Opus 4.7 (1M context) <noreply@anthropic.com>
</commit_message>
<xml_diff>
--- a/apps/legal-docs-blueprints/templates/inversiones/anexo2/carta_eleccion_hombre.docx
+++ b/apps/legal-docs-blueprints/templates/inversiones/anexo2/carta_eleccion_hombre.docx
@@ -276,7 +276,7 @@
           <w:shd w:fill="auto" w:val="clear"/>
           <w:vertAlign w:val="baseline"/>
         </w:rPr>
-        <w:t>de 20{anoTexto}</w:t>
+        <w:t>de 20{ano}</w:t>
       </w:r>
     </w:p>
     <w:p>
@@ -598,51 +598,7 @@
           <w:shd w:fill="auto" w:val="clear"/>
           <w:vertAlign w:val="baseline"/>
         </w:rPr>
-        <w:t>Texto</w:t>
-      </w:r>
-      <w:r>
-        <w:rPr>
-          <w:rFonts w:eastAsia="Cambria" w:cs="Cambria"/>
-          <w:b w:val="false"/>
-          <w:bCs w:val="false"/>
-          <w:i w:val="false"/>
-          <w:iCs w:val="false"/>
-          <w:caps w:val="false"/>
-          <w:smallCaps w:val="false"/>
-          <w:strike w:val="false"/>
-          <w:dstrike w:val="false"/>
-          <w:color w:val="000000"/>
-          <w:position w:val="0"/>
-          <w:sz w:val="22"/>
-          <w:sz w:val="22"/>
-          <w:szCs w:val="22"/>
-          <w:u w:val="none"/>
-          <w:shd w:fill="auto" w:val="clear"/>
-          <w:vertAlign w:val="baseline"/>
-        </w:rPr>
-        <w:t>} de {mesTexto} de dos mil {anoTexto}</w:t>
-      </w:r>
-      <w:r>
-        <w:rPr>
-          <w:rFonts w:eastAsia="Cambria" w:cs="Cambria"/>
-          <w:b w:val="false"/>
-          <w:bCs w:val="false"/>
-          <w:i w:val="false"/>
-          <w:iCs w:val="false"/>
-          <w:caps w:val="false"/>
-          <w:smallCaps w:val="false"/>
-          <w:strike w:val="false"/>
-          <w:dstrike w:val="false"/>
-          <w:color w:val="000000"/>
-          <w:position w:val="0"/>
-          <w:sz w:val="22"/>
-          <w:sz w:val="22"/>
-          <w:szCs w:val="22"/>
-          <w:u w:val="none"/>
-          <w:shd w:fill="auto" w:val="clear"/>
-          <w:vertAlign w:val="baseline"/>
-        </w:rPr>
-        <w:t>, por este medio manifiesto mi decisión respecto de la modalidad en que deseo recibir los pagos derivados de mis inversiones:</w:t>
+        <w:t>Texto} de {mesTexto} de dos mil {anoTexto}, por este medio manifiesto mi decisión respecto de la modalidad en que deseo recibir los pagos derivados de mis inversiones:</w:t>
       </w:r>
     </w:p>
     <w:p>
@@ -1403,6 +1359,44 @@
           <w:vertAlign w:val="baseline"/>
         </w:rPr>
         <w:t xml:space="preserve">{nombreCompleto} </w:t>
+      </w:r>
+    </w:p>
+    <w:p>
+      <w:pPr>
+        <w:pStyle w:val="normal1"/>
+        <w:widowControl w:val="false"/>
+        <w:shd w:val="clear" w:fill="auto"/>
+        <w:tabs>
+          <w:tab w:val="clear" w:pos="720"/>
+          <w:tab w:val="left" w:pos="7727" w:leader="none"/>
+        </w:tabs>
+        <w:suppressAutoHyphens w:val="true"/>
+        <w:bidi w:val="0"/>
+        <w:spacing w:lineRule="auto" w:line="240" w:before="0" w:after="0"/>
+        <w:ind w:hanging="0" w:left="340" w:right="0"/>
+        <w:jc w:val="left"/>
+        <w:rPr>
+          <w:rFonts w:ascii="Cambria" w:hAnsi="Cambria" w:eastAsia="Cambria" w:cs="Cambria"/>
+          <w:b w:val="false"/>
+          <w:bCs w:val="false"/>
+          <w:i w:val="false"/>
+          <w:i w:val="false"/>
+          <w:iCs w:val="false"/>
+          <w:caps w:val="false"/>
+          <w:smallCaps w:val="false"/>
+          <w:strike w:val="false"/>
+          <w:dstrike w:val="false"/>
+          <w:color w:val="000000"/>
+          <w:position w:val="0"/>
+          <w:sz w:val="22"/>
+          <w:sz w:val="22"/>
+          <w:szCs w:val="22"/>
+          <w:shd w:fill="auto" w:val="clear"/>
+          <w:vertAlign w:val="baseline"/>
+        </w:rPr>
+      </w:pPr>
+      <w:r>
+        <w:rPr/>
       </w:r>
     </w:p>
     <w:p>

</xml_diff>